<commit_message>
Add Ivory Beats usage to LTGD report tables
</commit_message>
<xml_diff>
--- a/reports/LTGD_AI_Use_Report_2026-09-30.docx
+++ b/reports/LTGD_AI_Use_Report_2026-09-30.docx
@@ -496,7 +496,7 @@
                 <w:color w:val="232A30"/>
                 <w:sz w:val="16"/>
               </w:rPr>
-              <w:t>“两组历史 LTGD 会话的记录总量较低；当前资料不能证明这种差异由扩展造成，也没有共同的玩法评分。”</w:t>
+              <w:t>“三组历史 LTGD 会话的记录总量较低；当前资料不能证明这种差异由扩展造成，也没有共同的玩法评分。”</w:t>
             </w:r>
           </w:p>
         </w:tc>
@@ -655,7 +655,7 @@
     </w:p>
     <w:p>
       <w:r>
-        <w:t>我用源码核对流程，尤其检查 recordVerification、finishTask 和 agent_before_settle 的转移；用测试结果确认这些分支可执行；用隔离副本重跑 Godot，避免把历史截图或会话总结误当作当前验证。写作后又检查夸大词、空泛的“闭环”说法和“不是……而是……”式句子，把它们改为有文件或测试支撑的动作。作图后逐条追踪箭头：Godot 失败不能直达 done，需求缺失不能绕过 Planner，Planner 不能直接改工程。最后渲染两份 DOCX，检查分页、表格、图中字形和箭头是否清楚。</w:t>
+        <w:t>我用源码核对流程，尤其检查 recordVerification、finishTask 和 agent_before_settle 的转移；用测试结果确认这些分支可执行；用隔离副本重跑 Godot，避免把历史截图或会话总结误当作当前验证。复核用量目录时还发现原英文表漏掉了 output/token_usage/PIB_LTGD/usage.json。补入后，Ivory Beats 的 Direct 与 LTGD 记录分别为 8,268,231 和 5,121,436 Total Tokens。写作后又检查夸大词、空泛的“闭环”说法和“不是……而是……”式句子，把它们改为有文件或测试支撑的动作。作图后逐条追踪箭头：Godot 失败不能直达 done，需求缺失不能绕过 Planner，Planner 不能直接改工程。最后渲染两份 DOCX，检查分页、表格、图中字形和箭头是否清楚。</w:t>
       </w:r>
     </w:p>
     <w:p>

</xml_diff>

<commit_message>
Explain LTGD role workflow and evidence-based conclusions
</commit_message>
<xml_diff>
--- a/reports/LTGD_AI_Use_Report_2026-09-30.docx
+++ b/reports/LTGD_AI_Use_Report_2026-09-30.docx
@@ -49,6 +49,34 @@
       </w:r>
     </w:p>
     <w:p>
+      <w:pPr>
+        <w:pStyle w:val="Heading2"/>
+      </w:pPr>
+      <w:r>
+        <w:t>2.1 三个角色怎样接力</w:t>
+      </w:r>
+    </w:p>
+    <w:p>
+      <w:r>
+        <w:t>Generator 是 Pi 原生编码 Agent。首次收到需求时，它直接在用户指定目录（未指定时为 Pi 当前目录的 game/）制作工程，不先开一轮正式规划；结束时用 &lt;ltgd-project-path&gt; 交出实际路径。修复轮收到的只是已确认的问题和 Planner 的短步骤，提示词要求它只改这些问题。这种安排把长对话和文件编辑留在 Generator 一侧。</w:t>
+      </w:r>
+    </w:p>
+    <w:p>
+      <w:r>
+        <w:t>Executor 是自动检查环节。Generator 结束本轮后，扩展的 agent_before_settle 钩子绑定其交接路径，要求该目录有 project.godot，再检查主场景、Godot 导入和无头启动。通过后，它用独立模型请求对照原始需求、任务文件和工程源码；工程指纹用于防止审查期间文件变化后仍沿用旧的 Godot PASS。只有引擎检查通过且需求审查返回 implemented，状态才到 done。引擎失败或审查发现具体缺项时，Executor 把证据送往 Planner。</w:t>
+      </w:r>
+    </w:p>
+    <w:p>
+      <w:r>
+        <w:t>Planner 不写游戏代码。Godot 报错时，它收到最新错误及相关源码片段；需求审查报缺项时，它收到缺项证据和工程概览。它只返回针对该问题的 JSON 修复步骤，或说明无法根据工程证据修复。随后 Generator 按步骤修改，Executor 再验。这样，规划发生在已观察到失败之后，且 Planner 无需读完 Generator 的整段对话。</w:t>
+      </w:r>
+    </w:p>
+    <w:p>
+      <w:r>
+        <w:t>测试中的一条交接路径很直观：主场景缺失使 Godot 检查失败；Planner 要求补场景。补完后 Godot 通过，但模拟的需求审查指出“信号扫描交互缺失”；Planner 再给出修复步骤。Generator 写入 Game.gd 后，下一轮检查与模拟审查通过，任务进入 done。这条测试证明状态能按预期流转，不能代替对扫描玩法的真人试玩。</w:t>
+      </w:r>
+    </w:p>
+    <w:p>
       <w:r>
         <w:t>这次没有把 AI 返回的“完成”当作测试结论。我运行了仓库的 12 项测试，结果为 12 通过、0 失败；其中包含真实 Godot 导入与启动。另将 output/game/ 的六份历史目录复制到临时目录后重查：五份通过导入和无头启动，MAG_direct 缺少 project.godot。这个结果只说明技术启动情况，不说明游戏玩法已经符合任务书。对历史用量，我保留了原始会话导出的数值，却没有据此写“LTGD 节省了多少 Token”的结论；这些会话早于当前实现，每个条件也只有一次记录。</w:t>
       </w:r>
@@ -95,6 +123,7 @@
       <w:tr>
         <w:trPr>
           <w:cantSplit/>
+          <w:tblHeader w:val="true"/>
         </w:trPr>
         <w:tc>
           <w:tcPr>
@@ -104,6 +133,7 @@
           </w:tcPr>
           <w:p>
             <w:pPr>
+              <w:keepNext/>
               <w:spacing w:after="0" w:before="0"/>
             </w:pPr>
             <w:r>
@@ -125,6 +155,7 @@
           </w:tcPr>
           <w:p>
             <w:pPr>
+              <w:keepNext/>
               <w:spacing w:after="0" w:before="0"/>
             </w:pPr>
             <w:r>
@@ -146,6 +177,7 @@
           </w:tcPr>
           <w:p>
             <w:pPr>
+              <w:keepNext/>
               <w:spacing w:after="0" w:before="0"/>
             </w:pPr>
             <w:r>
@@ -167,6 +199,7 @@
           </w:tcPr>
           <w:p>
             <w:pPr>
+              <w:keepNext/>
               <w:spacing w:after="0" w:before="0"/>
             </w:pPr>
             <w:r>
@@ -663,12 +696,17 @@
         <w:pStyle w:val="Heading1"/>
       </w:pPr>
       <w:r>
-        <w:t>6 仍需人工判断的部分</w:t>
+        <w:t>6 结论与仍需人工判断的部分</w:t>
       </w:r>
     </w:p>
     <w:p>
       <w:r>
-        <w:t>独立需求审查读取项目文字，无法代替玩家操作和视觉检查。Godot 无头启动也不会覆盖完整关卡流程。因此英文报告只把 12 项测试和五份工程启动通过写成技术证据。后续若要评价游戏质量或 Token 效率，需要固定任务输入，重复运行，并用同一套人工或外部玩法评价标准比较。</w:t>
+        <w:t>LTGD 已实现一条有明确交接条件的工作流：Generator 负责写与修，Executor 自动核查工程和原始需求，Planner 只对确认的失败提出修复步骤。12 项测试通过，说明这些分支及启动入口可执行；五份历史工程快照通过本次 Godot 启动检查。三组历史会话中，LTGD 的 Total Tokens 比对应 Direct 记录分别低 50.1%（Horror Signal Lost）、43.8%（Puzzle Magnet Lab）和 38.1%（Ivory Beats）；估算费用分别低 41.6%、31.0% 和 26.0%。这是三个单次任务的观察结果，与“减少无依据的规划和反复自检”的设计意图一致，但不能证明差异由当前版本造成。</w:t>
+      </w:r>
+    </w:p>
+    <w:p>
+      <w:r>
+        <w:t>独立需求审查读取项目文字，无法代替玩家操作和视觉检查。Godot 无头启动也不会覆盖完整关卡流程。因此目前可以得出“自动验证与失败后定向修复机制已实现、历史记录呈现较低用量”的结论，不能得出“游戏质量提高”或“当前版本稳定节省 Token”的结论。后两项需要固定任务输入、重复运行，并用同一套玩法评价标准比较。</w:t>
       </w:r>
     </w:p>
     <w:sectPr>

</xml_diff>

<commit_message>
Refocus LTGD reports on token accounting and PaT comparison
</commit_message>
<xml_diff>
--- a/reports/LTGD_AI_Use_Report_2026-09-30.docx
+++ b/reports/LTGD_AI_Use_Report_2026-09-30.docx
@@ -32,7 +32,7 @@
     </w:p>
     <w:p>
       <w:r>
-        <w:t>本项目把 Pi 对话作为游戏需求入口。Pi 的原生编码 Agent 担任 Generator，负责写 Godot 工程；LTGD 扩展在它结束一轮后自动调用 Godot，并用独立模型请求核查需求。只有检查发现明确失败时，Planner 才给出修复步骤。这是项目代码中实际存在的 AI 分工。编写本次报告时，我还使用 Codex 阅读源码、旧报告和历史记录，起草英文报告、改写中文说明，并用 Python 绘制框架图和排版 DOCX。绘图使用确定的形状与箭头，没有使用图像生成模型。</w:t>
+        <w:t>本项目把 Pi 对话作为游戏需求入口。Low-Token Game Development（LTGD）以减少生成游戏时的模型用量为目标：Generator 负责写 Godot 工程，Executor 自动执行引擎检查并发起需求审查，Planner 只在查出具体问题后给出修复步骤。Requirement Review 是 Executor 调用的模型审查阶段，不是第四个独立 Agent。编写本次报告时，我使用 Codex 阅读源码、旧报告、历史会话和 PaT 论文，重写英文报告的论证，核对用量，再用 Python 绘制框架图和排版 DOCX。绘图使用确定的形状与箭头，没有使用图像生成模型。</w:t>
       </w:r>
     </w:p>
     <w:p>
@@ -45,7 +45,7 @@
     </w:p>
     <w:p>
       <w:r>
-        <w:t>Generator 从用户的自然语言直接编写场景和脚本，最后交出真实工程路径。Executor 在 agent_before_settle 事件中读取该路径，运行结构、导入和无头启动检查。Godot 通过后，另一次短上下文模型调用对照原始需求、任务文件和项目源码，返回 implemented 或 missing。若检查确认失败，Planner 根据错误和相邻源码输出 JSON 修复步骤，再交给 Generator 修改。源码见 LTGDAgentSystem/godot-pat/index.ts、godot.ts、executor.ts 和 planner.ts。</w:t>
+        <w:t>Generator 从用户的自然语言直接编写场景和脚本，最后交出真实工程路径。Executor 在 agent_before_settle 事件中读取该路径，运行结构、导入和无头启动检查；这一步不调用语言模型。Godot 通过后，Executor 再发起一次独立模型请求，对照原始需求、任务文件和项目源码，返回 implemented 或 missing。若检查确认失败，Planner 根据错误和相邻源码输出 JSON 修复步骤，再交给 Generator 修改。源码见 LTGDAgentSystem/godot-pat/index.ts、godot.ts、executor.ts 和 planner.ts。</w:t>
       </w:r>
     </w:p>
     <w:p>
@@ -63,7 +63,7 @@
     </w:p>
     <w:p>
       <w:r>
-        <w:t>Executor 是自动检查环节。Generator 结束本轮后，扩展的 agent_before_settle 钩子绑定其交接路径，要求该目录有 project.godot，再检查主场景、Godot 导入和无头启动。通过后，它用独立模型请求对照原始需求、任务文件和工程源码；工程指纹用于防止审查期间文件变化后仍沿用旧的 Godot PASS。只有引擎检查通过且需求审查返回 implemented，状态才到 done。引擎失败或审查发现具体缺项时，Executor 把证据送往 Planner。</w:t>
+        <w:t>Executor 是自动检查环节。Generator 结束本轮后，扩展的 agent_before_settle 钩子绑定其交接路径，要求该目录有 project.godot，再检查主场景、Godot 导入和无头启动。通过后，它用独立模型请求对照原始需求、任务文件和工程源码；工程指纹用于防止审查期间文件变化后仍沿用旧的 Godot PASS。只有引擎检查通过且需求审查返回 implemented，状态才到 done。引擎失败或审查发现具体缺项时，Executor 把证据送往 Planner。需求审查读取的源码最多可达 240,000 字符，因此虽然它不继承 Generator 的完整对话，仍可能带来可观的输入 Token。</w:t>
       </w:r>
     </w:p>
     <w:p>
@@ -78,7 +78,7 @@
     </w:p>
     <w:p>
       <w:r>
-        <w:t>这次没有把 AI 返回的“完成”当作测试结论。我运行了仓库的 12 项测试，结果为 12 通过、0 失败；其中包含真实 Godot 导入与启动。另将 output/game/ 的六份历史目录复制到临时目录后重查：五份通过导入和无头启动，MAG_direct 缺少 project.godot。这个结果只说明技术启动情况，不说明游戏玩法已经符合任务书。对历史用量，我保留了原始会话导出的数值，却没有据此写“LTGD 节省了多少 Token”的结论；这些会话早于当前实现，每个条件也只有一次记录。</w:t>
+        <w:t>这次没有把 AI 返回的“完成”当作测试结论。我运行了仓库的 12 项系统实现测试，结果为 12 通过、0 失败；其中包含真实 Godot 导入与启动。另将 output/game/ 的六份历史目录复制到临时目录后重查：五份通过导入和无头启动，MAG_direct 缺少 project.godot。这个结果只说明技术启动情况，不说明游戏玩法已经符合任务书。历史用量部分分别列出调用次数、非缓存输入、缓存读取、输出、总 Token 和估算费用；三个任务中 LTGD 记录均较低，但这些会话早于当前实现，每个条件也只有一次记录，不能写成当前版本已证明的节省率。</w:t>
       </w:r>
     </w:p>
     <w:p>
@@ -91,12 +91,12 @@
     </w:p>
     <w:p>
       <w:r>
-        <w:t>英文报告的初稿依据 README、扩展源码、测试、历史 DOCX 和用量导出生成。我逐段核对“谁触发下一步”“检查的是哪个目录”“通过的含义”以及每个数字的来源。旧 DOCX 写的是手动 godot_verify、先局部修复再规划、godot_finish 完成；当前代码已改成结束轮次后自动检查、首次确认失败即调用 Planner、独立需求审查后才完成。英文报告因此重写了方法、图注和局限性，而不是沿用旧稿的流程。</w:t>
+        <w:t>英文报告的初稿依据 README、扩展源码、测试、历史 DOCX 和用量导出生成。我逐段核对“谁触发下一步”“检查的是哪个目录”“通过的含义”以及每个数字的来源。旧 DOCX 写的是手动 godot_verify、先局部修复再规划、godot_finish 完成；当前代码已改成结束轮次后自动检查、首次确认失败即调用 Planner、独立需求审查后才完成。随后参考 Yoon 等的 PaT 论文，将英文报告的主线改成“直接尝试—执行反馈—失败后规划—成本与完成度共同评价”。借用的是论证顺序和规划时机，没有把论文的 Best-of-N、递归分解、异构模型实验或成本数字写成 LTGD 已实现的内容。</w:t>
       </w:r>
     </w:p>
     <w:p>
       <w:r>
-        <w:t>框架图用 Python 绘制，先列节点，再为每条箭头写触发条件。图 1 区分 Pi、LTGD 扩展、Godot 和两个模型审查步骤；图 2 单独表示失败与返回路径。英文报告的图注限定了图的证据范围：done 需要 Godot PASS 和需求审查通过，但图不能证明游戏可玩。</w:t>
+        <w:t>框架图用 Python 绘制，先列节点，再为每条箭头写触发条件。图 1 区分 Pi、Generator、Executor、Planner 与 Godot；图 2 把 Executor review 明确标为 Executor 的阶段，并在 Godot 检查处标“0 LLM tokens”、在审查和 Planner 处标出额外模型调用。英文报告的图注限定了图的证据范围：done 需要 Godot PASS 和需求审查通过，但图不能证明游戏可玩。</w:t>
       </w:r>
     </w:p>
     <w:p>
@@ -554,6 +554,261 @@
           </w:p>
         </w:tc>
       </w:tr>
+      <w:tr>
+        <w:trPr>
+          <w:cantSplit/>
+        </w:trPr>
+        <w:tc>
+          <w:tcPr>
+            <w:tcW w:type="dxa" w:w="1339"/>
+            <w:vAlign w:val="center"/>
+          </w:tcPr>
+          <w:p>
+            <w:pPr>
+              <w:spacing w:after="0" w:before="0"/>
+            </w:pPr>
+            <w:r>
+              <w:rPr>
+                <w:rFonts w:ascii="Microsoft YaHei" w:hAnsi="Microsoft YaHei"/>
+                <w:b w:val="0"/>
+                <w:color w:val="232A30"/>
+                <w:sz w:val="16"/>
+              </w:rPr>
+              <w:t>token 指标</w:t>
+            </w:r>
+          </w:p>
+        </w:tc>
+        <w:tc>
+          <w:tcPr>
+            <w:tcW w:type="dxa" w:w="2707"/>
+            <w:vAlign w:val="center"/>
+          </w:tcPr>
+          <w:p>
+            <w:pPr>
+              <w:spacing w:after="0" w:before="0"/>
+            </w:pPr>
+            <w:r>
+              <w:rPr>
+                <w:rFonts w:ascii="Microsoft YaHei" w:hAnsi="Microsoft YaHei"/>
+                <w:b w:val="0"/>
+                <w:color w:val="232A30"/>
+                <w:sz w:val="16"/>
+              </w:rPr>
+              <w:t>只列 Total Tokens，并直接把总量降低解释为费用降低。</w:t>
+            </w:r>
+          </w:p>
+        </w:tc>
+        <w:tc>
+          <w:tcPr>
+            <w:tcW w:type="dxa" w:w="3154"/>
+            <w:vAlign w:val="center"/>
+          </w:tcPr>
+          <w:p>
+            <w:pPr>
+              <w:spacing w:after="0" w:before="0"/>
+            </w:pPr>
+            <w:r>
+              <w:rPr>
+                <w:rFonts w:ascii="Microsoft YaHei" w:hAnsi="Microsoft YaHei"/>
+                <w:b w:val="0"/>
+                <w:color w:val="232A30"/>
+                <w:sz w:val="16"/>
+              </w:rPr>
+              <w:t>英文表 1 列出六次会话的 Calls、Input、Cache read、Output、Total Tokens 和 Cost；表 2 再列同任务的降幅。</w:t>
+            </w:r>
+          </w:p>
+        </w:tc>
+        <w:tc>
+          <w:tcPr>
+            <w:tcW w:type="dxa" w:w="2549"/>
+            <w:vAlign w:val="center"/>
+          </w:tcPr>
+          <w:p>
+            <w:pPr>
+              <w:spacing w:after="0" w:before="0"/>
+            </w:pPr>
+            <w:r>
+              <w:rPr>
+                <w:rFonts w:ascii="Microsoft YaHei" w:hAnsi="Microsoft YaHei"/>
+                <w:b w:val="0"/>
+                <w:color w:val="232A30"/>
+                <w:sz w:val="16"/>
+              </w:rPr>
+              <w:t>缓存读取占总量的大部分，计价也不同；分项后才能看出减少的是重复上下文、输出还是调用。</w:t>
+            </w:r>
+          </w:p>
+        </w:tc>
+      </w:tr>
+      <w:tr>
+        <w:trPr>
+          <w:cantSplit/>
+        </w:trPr>
+        <w:tc>
+          <w:tcPr>
+            <w:tcW w:type="dxa" w:w="1339"/>
+            <w:vAlign w:val="center"/>
+          </w:tcPr>
+          <w:p>
+            <w:pPr>
+              <w:spacing w:after="0" w:before="0"/>
+            </w:pPr>
+            <w:r>
+              <w:rPr>
+                <w:rFonts w:ascii="Microsoft YaHei" w:hAnsi="Microsoft YaHei"/>
+                <w:b w:val="0"/>
+                <w:color w:val="232A30"/>
+                <w:sz w:val="16"/>
+              </w:rPr>
+              <w:t>角色与图</w:t>
+            </w:r>
+          </w:p>
+        </w:tc>
+        <w:tc>
+          <w:tcPr>
+            <w:tcW w:type="dxa" w:w="2707"/>
+            <w:vAlign w:val="center"/>
+          </w:tcPr>
+          <w:p>
+            <w:pPr>
+              <w:spacing w:after="0" w:before="0"/>
+            </w:pPr>
+            <w:r>
+              <w:rPr>
+                <w:rFonts w:ascii="Microsoft YaHei" w:hAnsi="Microsoft YaHei"/>
+                <w:b w:val="0"/>
+                <w:color w:val="232A30"/>
+                <w:sz w:val="16"/>
+              </w:rPr>
+              <w:t>图 2 把 Review 画成与 Executor 并列的框，容易被读成第四个 Agent。</w:t>
+            </w:r>
+          </w:p>
+        </w:tc>
+        <w:tc>
+          <w:tcPr>
+            <w:tcW w:type="dxa" w:w="3154"/>
+            <w:vAlign w:val="center"/>
+          </w:tcPr>
+          <w:p>
+            <w:pPr>
+              <w:spacing w:after="0" w:before="0"/>
+            </w:pPr>
+            <w:r>
+              <w:rPr>
+                <w:rFonts w:ascii="Microsoft YaHei" w:hAnsi="Microsoft YaHei"/>
+                <w:b w:val="0"/>
+                <w:color w:val="232A30"/>
+                <w:sz w:val="16"/>
+              </w:rPr>
+              <w:t>框名改为 “Executor review”，标明它增加一次模型调用。</w:t>
+            </w:r>
+          </w:p>
+        </w:tc>
+        <w:tc>
+          <w:tcPr>
+            <w:tcW w:type="dxa" w:w="2549"/>
+            <w:vAlign w:val="center"/>
+          </w:tcPr>
+          <w:p>
+            <w:pPr>
+              <w:spacing w:after="0" w:before="0"/>
+            </w:pPr>
+            <w:r>
+              <w:rPr>
+                <w:rFonts w:ascii="Microsoft YaHei" w:hAnsi="Microsoft YaHei"/>
+                <w:b w:val="0"/>
+                <w:color w:val="232A30"/>
+                <w:sz w:val="16"/>
+              </w:rPr>
+              <w:t>executor.ts 定义审查，index.ts 在 Executor 流程中发起模型请求。</w:t>
+            </w:r>
+          </w:p>
+        </w:tc>
+      </w:tr>
+      <w:tr>
+        <w:trPr>
+          <w:cantSplit/>
+        </w:trPr>
+        <w:tc>
+          <w:tcPr>
+            <w:tcW w:type="dxa" w:w="1339"/>
+            <w:vAlign w:val="center"/>
+          </w:tcPr>
+          <w:p>
+            <w:pPr>
+              <w:spacing w:after="0" w:before="0"/>
+            </w:pPr>
+            <w:r>
+              <w:rPr>
+                <w:rFonts w:ascii="Microsoft YaHei" w:hAnsi="Microsoft YaHei"/>
+                <w:b w:val="0"/>
+                <w:color w:val="232A30"/>
+                <w:sz w:val="16"/>
+              </w:rPr>
+              <w:t>论文类比</w:t>
+            </w:r>
+          </w:p>
+        </w:tc>
+        <w:tc>
+          <w:tcPr>
+            <w:tcW w:type="dxa" w:w="2707"/>
+            <w:vAlign w:val="center"/>
+          </w:tcPr>
+          <w:p>
+            <w:pPr>
+              <w:spacing w:after="0" w:before="0"/>
+            </w:pPr>
+            <w:r>
+              <w:rPr>
+                <w:rFonts w:ascii="Microsoft YaHei" w:hAnsi="Microsoft YaHei"/>
+                <w:b w:val="0"/>
+                <w:color w:val="232A30"/>
+                <w:sz w:val="16"/>
+              </w:rPr>
+              <w:t>“采用 PaT，所以 LTGD 更省 Token。”</w:t>
+            </w:r>
+          </w:p>
+        </w:tc>
+        <w:tc>
+          <w:tcPr>
+            <w:tcW w:type="dxa" w:w="3154"/>
+            <w:vAlign w:val="center"/>
+          </w:tcPr>
+          <w:p>
+            <w:pPr>
+              <w:spacing w:after="0" w:before="0"/>
+            </w:pPr>
+            <w:r>
+              <w:rPr>
+                <w:rFonts w:ascii="Microsoft YaHei" w:hAnsi="Microsoft YaHei"/>
+                <w:b w:val="0"/>
+                <w:color w:val="232A30"/>
+                <w:sz w:val="16"/>
+              </w:rPr>
+              <w:t>“LTGD 在失败后才调用 Planner；三组历史日志呈现较低用量，但没有 always-plan 消融，也没有等质量对照。”</w:t>
+            </w:r>
+          </w:p>
+        </w:tc>
+        <w:tc>
+          <w:tcPr>
+            <w:tcW w:type="dxa" w:w="2549"/>
+            <w:vAlign w:val="center"/>
+          </w:tcPr>
+          <w:p>
+            <w:pPr>
+              <w:spacing w:after="0" w:before="0"/>
+            </w:pPr>
+            <w:r>
+              <w:rPr>
+                <w:rFonts w:ascii="Microsoft YaHei" w:hAnsi="Microsoft YaHei"/>
+                <w:b w:val="0"/>
+                <w:color w:val="232A30"/>
+                <w:sz w:val="16"/>
+              </w:rPr>
+              <w:t>PaT 的论证启发规划时机；它的实验数字不能替代 LTGD 的证据。</w:t>
+            </w:r>
+          </w:p>
+        </w:tc>
+      </w:tr>
     </w:tbl>
     <w:p>
       <w:pPr>
@@ -573,7 +828,7 @@
       <w:r>
         <w:drawing>
           <wp:inline xmlns:a="http://schemas.openxmlformats.org/drawingml/2006/main" xmlns:pic="http://schemas.openxmlformats.org/drawingml/2006/picture">
-            <wp:extent cx="6172200" cy="1885950"/>
+            <wp:extent cx="5623560" cy="1718310"/>
             <wp:docPr id="1" name="Picture 1"/>
             <wp:cNvGraphicFramePr>
               <a:graphicFrameLocks noChangeAspect="1"/>
@@ -594,7 +849,7 @@
                   <pic:spPr>
                     <a:xfrm>
                       <a:off x="0" y="0"/>
-                      <a:ext cx="6172200" cy="1885950"/>
+                      <a:ext cx="5623560" cy="1718310"/>
                     </a:xfrm>
                     <a:prstGeom prst="rect"/>
                   </pic:spPr>
@@ -621,7 +876,7 @@
     </w:p>
     <w:p>
       <w:r>
-        <w:t>英文技术报告使用的新版图把两个失败入口都接到 Planner，并把 Godot 检查和需求审查分开。箭头上的 FAIL、MISSING、PASS 是实际分支条件，不是装饰。</w:t>
+        <w:t>英文技术报告使用的新版图把两个失败入口都接到 Planner，并把 Godot 检查和需求审查分开。箭头上的 FAIL、MISSING、PASS 是实际分支条件。图中也显示省 Token 的条件：首轮通过时跳过 Planner；如果失败，则增加 Planner 和下一轮 Generator 调用。需求审查是每次 Godot PASS 后必须付出的模型成本。</w:t>
       </w:r>
     </w:p>
     <w:p>
@@ -632,7 +887,7 @@
       <w:r>
         <w:drawing>
           <wp:inline xmlns:a="http://schemas.openxmlformats.org/drawingml/2006/main" xmlns:pic="http://schemas.openxmlformats.org/drawingml/2006/picture">
-            <wp:extent cx="6172200" cy="2948940"/>
+            <wp:extent cx="5623560" cy="2686812"/>
             <wp:docPr id="2" name="Picture 2"/>
             <wp:cNvGraphicFramePr>
               <a:graphicFrameLocks noChangeAspect="1"/>
@@ -653,7 +908,7 @@
                   <pic:spPr>
                     <a:xfrm>
                       <a:off x="0" y="0"/>
-                      <a:ext cx="6172200" cy="2948940"/>
+                      <a:ext cx="5623560" cy="2686812"/>
                     </a:xfrm>
                     <a:prstGeom prst="rect"/>
                   </pic:spPr>
@@ -688,7 +943,7 @@
     </w:p>
     <w:p>
       <w:r>
-        <w:t>我用源码核对流程，尤其检查 recordVerification、finishTask 和 agent_before_settle 的转移；用测试结果确认这些分支可执行；用隔离副本重跑 Godot，避免把历史截图或会话总结误当作当前验证。复核用量目录时还发现原英文表漏掉了 output/token_usage/PIB_LTGD/usage.json。补入后，Ivory Beats 的 Direct 与 LTGD 记录分别为 8,268,231 和 5,121,436 Total Tokens。写作后又检查夸大词、空泛的“闭环”说法和“不是……而是……”式句子，把它们改为有文件或测试支撑的动作。作图后逐条追踪箭头：Godot 失败不能直达 done，需求缺失不能绕过 Planner，Planner 不能直接改工程。最后渲染两份 DOCX，检查分页、表格、图中字形和箭头是否清楚。</w:t>
+        <w:t>我用源码核对流程，尤其检查 recordVerification、finishTask 和 agent_before_settle 的转移；用测试结果确认这些分支可执行；用隔离副本重跑 Godot，避免把历史截图或会话总结误当作当前验证。复核用量目录时发现原英文表漏掉了 output/token_usage/PIB_LTGD/usage.json，补入后 Ivory Beats 的 Direct 与 LTGD 总量分别为 8,268,231 和 5,121,436 Token。我又逐个读取六份会话的首条用户需求和模型设置：每对首条任务文本完全一致，工作目录、模型与 high 思考设置一致；日志不能证明运行时文件快照和其他扩展配置完全相同，因此英文报告没有把它们称为严格控制实验。写作后检查夸大词和空泛“闭环”说法，作图后逐条追踪箭头，并渲染 DOCX 检查分页、表格和图中字形。</w:t>
       </w:r>
     </w:p>
     <w:p>
@@ -701,12 +956,17 @@
     </w:p>
     <w:p>
       <w:r>
-        <w:t>LTGD 已实现一条有明确交接条件的工作流：Generator 负责写与修，Executor 自动核查工程和原始需求，Planner 只对确认的失败提出修复步骤。12 项测试通过，说明这些分支及启动入口可执行；五份历史工程快照通过本次 Godot 启动检查。三组历史会话中，LTGD 的 Total Tokens 比对应 Direct 记录分别低 50.1%（Horror Signal Lost）、43.8%（Puzzle Magnet Lab）和 38.1%（Ivory Beats）；估算费用分别低 41.6%、31.0% 和 26.0%。这是三个单次任务的观察结果，与“减少无依据的规划和反复自检”的设计意图一致，但不能证明差异由当前版本造成。</w:t>
+        <w:t>LTGD 已实现一条有明确交接条件的工作流：Generator 负责写与修，Executor 用本地 Godot 检查工程并通过模型核查原始需求，Planner 只对确认的失败提出修复步骤。首轮通过时不产生 Planner 调用；失败时才支付短证据规划与下一轮生成的成本。12 项系统测试通过，说明这些分支及启动入口可执行；五份历史工程快照通过本次 Godot 启动检查。三组历史会话中，LTGD 的 Total Tokens 比对应 Direct 记录低 38.1%–50.1%，估算费用低 26.0%–41.6%；下降最多的是缓存读取量。这些是旧版本单次会话的观察结果，与设计意图一致，却不能证明当前版本能稳定地以同等游戏完成度省 Token。</w:t>
       </w:r>
     </w:p>
     <w:p>
       <w:r>
-        <w:t>独立需求审查读取项目文字，无法代替玩家操作和视觉检查。Godot 无头启动也不会覆盖完整关卡流程。因此目前可以得出“自动验证与失败后定向修复机制已实现、历史记录呈现较低用量”的结论，不能得出“游戏质量提高”或“当前版本稳定节省 Token”的结论。后两项需要固定任务输入、重复运行，并用同一套玩法评价标准比较。</w:t>
+        <w:t>独立需求审查读取项目文字，无法代替玩家操作和视觉检查；它自身还增加一次模型调用。Godot 无头启动也不会覆盖完整关卡流程。因此目前可以得出“自动验证与失败后定向修复机制已实现、历史记录呈现较低用量”的结论，不能得出“游戏质量提高”或“当前版本稳定节省 Token”的结论。后两项需要固定任务输入与验收标准，重复运行 Direct、LTGD 和始终预先规划的版本，并比较每次调用、Token、费用和共同的玩法通过率。</w:t>
+      </w:r>
+    </w:p>
+    <w:p>
+      <w:r>
+        <w:t>写作参考：Yoon 等，PaT Planning-after-Trial for Efficient Test-Time Code Generation，ACL 2026，https://aclanthology.org/2026.acl-long.1703/ 。</w:t>
       </w:r>
     </w:p>
     <w:sectPr>
@@ -1102,12 +1362,12 @@
     <w:qFormat/>
     <w:rsid w:val="00FC693F"/>
     <w:pPr>
-      <w:spacing w:after="140" w:line="281" w:lineRule="auto"/>
+      <w:spacing w:after="100" w:line="269" w:lineRule="auto"/>
     </w:pPr>
     <w:rPr>
       <w:rFonts w:ascii="Microsoft YaHei" w:hAnsi="Microsoft YaHei"/>
       <w:color w:val="232A30"/>
-      <w:sz w:val="21"/>
+      <w:sz w:val="20"/>
     </w:rPr>
   </w:style>
   <w:style w:type="paragraph" w:styleId="Header">
@@ -1165,7 +1425,7 @@
     <w:pPr>
       <w:keepNext/>
       <w:keepLines/>
-      <w:spacing w:before="260" w:after="120"/>
+      <w:spacing w:before="200" w:after="100"/>
       <w:outlineLvl w:val="0"/>
     </w:pPr>
     <w:rPr>
@@ -1189,7 +1449,7 @@
     <w:pPr>
       <w:keepNext/>
       <w:keepLines/>
-      <w:spacing w:before="260" w:after="120"/>
+      <w:spacing w:before="200" w:after="100"/>
       <w:outlineLvl w:val="1"/>
     </w:pPr>
     <w:rPr>

</xml_diff>

<commit_message>
Compare LTGD token totals by game in table and chart
</commit_message>
<xml_diff>
--- a/reports/LTGD_AI_Use_Report_2026-09-30.docx
+++ b/reports/LTGD_AI_Use_Report_2026-09-30.docx
@@ -96,7 +96,7 @@
     </w:p>
     <w:p>
       <w:r>
-        <w:t>框架图用 Python 绘制，先列节点，再为每条箭头写触发条件。图 1 区分 Pi、Generator、Executor、Planner 与 Godot；图 2 把 Executor review 明确标为 Executor 的阶段，并在 Godot 检查处标“0 LLM tokens”、在审查和 Planner 处标出额外模型调用。英文报告的图注限定了图的证据范围：done 需要 Godot PASS 和需求审查通过，但图不能证明游戏可玩。</w:t>
+        <w:t>框架图用 Python 绘制，先列节点，再为每条箭头写触发条件。图 1 区分 Pi、Generator、Executor、Planner 与 Godot；图 2 把 Executor review 明确标为 Executor 的阶段，并在 Godot 检查处标“0 LLM tokens”、在审查和 Planner 处标出额外模型调用。英文报告的图注限定了图的证据范围：done 需要 Godot PASS 和需求审查通过，但图不能证明游戏可玩。新增的图 3 从六份 usage.json 读取 Total Tokens，以每个游戏的 Baseline 与 LTGD 两根柱子显示差距；柱顶标出总量，游戏名下标出相对 Baseline 的节约率。</w:t>
       </w:r>
     </w:p>
     <w:p>
@@ -574,7 +574,7 @@
                 <w:color w:val="232A30"/>
                 <w:sz w:val="16"/>
               </w:rPr>
-              <w:t>token 指标</w:t>
+              <w:t>token 指标与表图</w:t>
             </w:r>
           </w:p>
         </w:tc>
@@ -594,7 +594,7 @@
                 <w:color w:val="232A30"/>
                 <w:sz w:val="16"/>
               </w:rPr>
-              <w:t>只列 Total Tokens，并直接把总量降低解释为费用降低。</w:t>
+              <w:t>初稿重复列游戏名，六行数值难以按游戏对照；只看 Total Tokens 还会掩盖缓存读取与费用的区别。</w:t>
             </w:r>
           </w:p>
         </w:tc>
@@ -614,7 +614,7 @@
                 <w:color w:val="232A30"/>
                 <w:sz w:val="16"/>
               </w:rPr>
-              <w:t>英文表 1 列出六次会话的 Calls、Input、Cache read、Output、Total Tokens 和 Cost；表 2 再列同任务的降幅。</w:t>
+              <w:t>英文表 1 每个游戏占一行，Baseline 与 LTGD 分列，保留 Calls、Input、Cache read、Output、Total 和 Cost；末列给出总 Token 节约率。图 3 用成对柱子呈现总量差距。</w:t>
             </w:r>
           </w:p>
         </w:tc>
@@ -634,7 +634,7 @@
                 <w:color w:val="232A30"/>
                 <w:sz w:val="16"/>
               </w:rPr>
-              <w:t>缓存读取占总量的大部分，计价也不同；分项后才能看出减少的是重复上下文、输出还是调用。</w:t>
+              <w:t>按游戏配对更容易核对；题注写明计算式、缓存写入为零及单次历史会话的范围。</w:t>
             </w:r>
           </w:p>
         </w:tc>
@@ -943,7 +943,7 @@
     </w:p>
     <w:p>
       <w:r>
-        <w:t>我用源码核对流程，尤其检查 recordVerification、finishTask 和 agent_before_settle 的转移；用测试结果确认这些分支可执行；用隔离副本重跑 Godot，避免把历史截图或会话总结误当作当前验证。复核用量目录时发现原英文表漏掉了 output/token_usage/PIB_LTGD/usage.json，补入后 Ivory Beats 的 Direct 与 LTGD 总量分别为 8,268,231 和 5,121,436 Token。我又逐个读取六份会话的首条用户需求和模型设置：每对首条任务文本完全一致，工作目录、模型与 high 思考设置一致；日志不能证明运行时文件快照和其他扩展配置完全相同，因此英文报告没有把它们称为严格控制实验。写作后检查夸大词和空泛“闭环”说法，作图后逐条追踪箭头，并渲染 DOCX 检查分页、表格和图中字形。</w:t>
+        <w:t>我用源码核对流程，尤其检查 recordVerification、finishTask 和 agent_before_settle 的转移；用测试结果确认这些分支可执行；用隔离副本重跑 Godot，避免把历史截图或会话总结误当作当前验证。复核用量目录时发现原英文表漏掉了 output/token_usage/PIB_LTGD/usage.json，补入后 Ivory Beats 的 Baseline 与 LTGD 总量分别为 8,268,231 和 5,121,436 Token。我逐个读取六份会话的首条用户需求和模型设置：每对首条任务文本完全一致，工作目录、模型与 high 思考设置一致；日志不能证明运行时文件快照和其他扩展配置完全相同，因此英文报告没有把它们称为严格控制实验。制表和作图后，我用原始 JSON 重算节约率，逐项核对表内总量、百分比和柱顶标注，并渲染 DOCX 检查分页、表格和图中字形。</w:t>
       </w:r>
     </w:p>
     <w:p>
@@ -962,11 +962,6 @@
     <w:p>
       <w:r>
         <w:t>独立需求审查读取项目文字，无法代替玩家操作和视觉检查；它自身还增加一次模型调用。Godot 无头启动也不会覆盖完整关卡流程。因此目前可以得出“自动验证与失败后定向修复机制已实现、历史记录呈现较低用量”的结论，不能得出“游戏质量提高”或“当前版本稳定节省 Token”的结论。后两项需要固定任务输入与验收标准，重复运行 Direct、LTGD 和始终预先规划的版本，并比较每次调用、Token、费用和共同的玩法通过率。</w:t>
-      </w:r>
-    </w:p>
-    <w:p>
-      <w:r>
-        <w:t>写作参考：Yoon 等，PaT Planning-after-Trial for Efficient Test-Time Code Generation，ACL 2026，https://aclanthology.org/2026.acl-long.1703/ 。</w:t>
       </w:r>
     </w:p>
     <w:sectPr>

</xml_diff>

<commit_message>
docs: refocus LTGD AI use report on system development
</commit_message>
<xml_diff>
--- a/reports/LTGD_AI_Use_Report_2026-09-30.docx
+++ b/reports/LTGD_AI_Use_Report_2026-09-30.docx
@@ -19,7 +19,7 @@
           <w:color w:val="535D68"/>
           <w:sz w:val="18"/>
         </w:rPr>
-        <w:t>编码、报告写作与框架图制作记录 | 2026 年 9 月 30 日</w:t>
+        <w:t>Agent System 开发过程记录 | 2026 年 9 月 30 日</w:t>
       </w:r>
     </w:p>
     <w:p>
@@ -27,12 +27,17 @@
         <w:pStyle w:val="Heading1"/>
       </w:pPr>
       <w:r>
-        <w:t>1 使用范围</w:t>
+        <w:t>1 报告范围</w:t>
       </w:r>
     </w:p>
     <w:p>
       <w:r>
-        <w:t>本项目把 Pi 对话作为游戏需求入口。Low-Token Game Development（LTGD）以减少生成游戏时的模型用量为目标：Generator 负责写 Godot 工程，Executor 自动执行引擎检查并发起需求审查，Planner 只在查出具体问题后给出修复步骤。Requirement Review 是 Executor 调用的模型审查阶段，不是第四个独立 Agent。编写本次报告时，我使用 Codex 阅读源码、旧报告、历史会话和 PaT 论文，重写英文报告的论证，核对用量，再用 Python 绘制框架图和排版 DOCX。绘图使用确定的形状与箭头，没有使用图像生成模型。</w:t>
+        <w:t>本报告中的“AI 辅助使用”，指我如何借助 AI 开发 LTGD Agent System，而不是 LTGD 在运行时如何用 Generator、Executor 和 Planner 生成游戏。我的主要工作是提出问题、确定系统应做和不应做的事、用自然语言交代需求，并对 AI 提交的实现进行审阅和测试。AI 负责阅读现有项目、提出实现方案、编写代码和文档、根据反馈修改。最终是否符合目标，由我结合代码、实际运行和游戏体验判断。</w:t>
+      </w:r>
+    </w:p>
+    <w:p>
+      <w:r>
+        <w:t>LTGD 的开发目标是让用户留在 Pi 对话中提出游戏需求，由扩展组织 Godot 游戏生成、验证和必要的修复。这个目标有两个需要同时满足的方面：系统应能产出可检查的游戏工程，也应控制不必要的模型调用。项目中的技术报告讨论系统机制与历史 Token 记录；本报告记录人和 AI 如何协作把机制做出来，以及人工判断在其中起到的作用。</w:t>
       </w:r>
     </w:p>
     <w:p>
@@ -40,12 +45,35 @@
         <w:pStyle w:val="Heading1"/>
       </w:pPr>
       <w:r>
-        <w:t>2 AI 如何辅助编码</w:t>
+        <w:t>2 从问题定义到开发边界</w:t>
       </w:r>
     </w:p>
     <w:p>
       <w:r>
-        <w:t>Generator 从用户的自然语言直接编写场景和脚本，最后交出真实工程路径。Executor 在 agent_before_settle 事件中读取该路径，运行结构、导入和无头启动检查；这一步不调用语言模型。Godot 通过后，Executor 再发起一次独立模型请求，对照原始需求、任务文件和项目源码，返回 implemented 或 missing。若检查确认失败，Planner 根据错误和相邻源码输出 JSON 修复步骤，再交给 Generator 修改。源码见 LTGDAgentSystem/godot-pat/index.ts、godot.ts、executor.ts 和 planner.ts。</w:t>
+        <w:t>开始写代码前，我先把宽泛的想法收敛为一个可实现的问题：如何让 Pi 接收自然语言游戏需求，先生成一个 Godot 工程，再根据检查结果决定是否需要规划修复，而不是在每次任务开始时都增加一轮规划。这个描述给 AI 指出了目标和判断依据，但没有替它逐行设计实现。</w:t>
+      </w:r>
+    </w:p>
+    <w:p>
+      <w:r>
+        <w:t>我进一步用自然语言说明边界。Pi 对话是用户入口；LTGD 专用扩展和 CMD 启动脚本留在 LTGDAgentSystem/；正常使用调用已安装的 pi，不要求本地 PiAgent/ 源码。游戏写入用户指定目录，未指定时写入 Pi 当前目录下的 game/。共享的 assets/ 和 Godot_Engine/ 作为输入，生成游戏时不得改动；原来的 GameEva/ 只供迁移参考。Godot 验证结果留在 Pi 会话中。这些约束使 AI 能判断哪些实现是任务的一部分，哪些改动会越界。</w:t>
+      </w:r>
+    </w:p>
+    <w:p>
+      <w:r>
+        <w:t>边界还包括完成标准。Godot 能导入和启动，只能说明工程通过有限的技术检查；源码层面的需求审查也不能替代玩家实际操作。因此，开发任务中的“完成”要分别看代码是否实现约定流程、自动检查是否正常运行，以及人工试玩是否符合预期。把这几个层次写清楚，可以避免 AI 把一次工具返回的 PASS 直接写成“游戏质量已得到证明”。</w:t>
+      </w:r>
+    </w:p>
+    <w:p>
+      <w:pPr>
+        <w:pStyle w:val="Heading1"/>
+      </w:pPr>
+      <w:r>
+        <w:t>3 用自然语言把工作交给 AI</w:t>
+      </w:r>
+    </w:p>
+    <w:p>
+      <w:r>
+        <w:t>我把需求交给 AI 时，通常先说明要解决的现象，再说明目标行为、约束和验收方式。这样的任务说明不要求我先写出 TypeScript 代码，却能让 AI 根据项目结构自行定位 index.ts、controller.ts、godot.ts 等文件。</w:t>
       </w:r>
     </w:p>
     <w:p>
@@ -53,32 +81,30 @@
         <w:pStyle w:val="Heading2"/>
       </w:pPr>
       <w:r>
-        <w:t>2.1 三个角色怎样接力</w:t>
+        <w:t>3.1 任务说明示例</w:t>
+      </w:r>
+    </w:p>
+    <w:p>
+      <w:pPr>
+        <w:keepNext/>
+      </w:pPr>
+      <w:r>
+        <w:t>以下是对项目开发要求的概括性表达，并非逐字保存的历史提示词：</w:t>
       </w:r>
     </w:p>
     <w:p>
       <w:r>
-        <w:t>Generator 是 Pi 原生编码 Agent。首次收到需求时，它直接在用户指定目录（未指定时为 Pi 当前目录的 game/）制作工程，不先开一轮正式规划；结束时用 &lt;ltgd-project-path&gt; 交出实际路径。修复轮收到的只是已确认的问题和 Planner 的短步骤，提示词要求它只改这些问题。这种安排把长对话和文件编辑留在 Generator 一侧。</w:t>
+        <w:t>“用户直接在 Pi 里描述游戏；Generator 第一轮先做出可检查的 Godot 工程。它结束后自动检查实际交出的项目目录。Godot 失败或原始需求有明确缺项时，再让 Planner 根据证据给出修复步骤。请保留已安装 Pi 的启动方式，不修改共享素材和引擎，并用测试覆盖交接与失败分支。”</w:t>
       </w:r>
     </w:p>
     <w:p>
       <w:r>
-        <w:t>Executor 是自动检查环节。Generator 结束本轮后，扩展的 agent_before_settle 钩子绑定其交接路径，要求该目录有 project.godot，再检查主场景、Godot 导入和无头启动。通过后，它用独立模型请求对照原始需求、任务文件和工程源码；工程指纹用于防止审查期间文件变化后仍沿用旧的 Godot PASS。只有引擎检查通过且需求审查返回 implemented，状态才到 done。引擎失败或审查发现具体缺项时，Executor 把证据送往 Planner。需求审查读取的源码最多可达 240,000 字符，因此虽然它不继承 Generator 的完整对话，仍可能带来可观的输入 Token。</w:t>
+        <w:t>AI 根据这样的描述阅读现有代码、实现扩展的事件钩子和状态转换、编写或调整测试，再把改动和运行结果交给我看。我继续用自然语言指出不合适的行为，例如“检查了错误的目录”“第一次失败没有进入规划”“完成状态缺少需求核查”。反馈指向可观察的问题，AI 才能修改对应的交接、分支或提示词，而不是进行没有明确目标的重构。</w:t>
       </w:r>
     </w:p>
     <w:p>
       <w:r>
-        <w:t>Planner 不写游戏代码。Godot 报错时，它收到最新错误及相关源码片段；需求审查报缺项时，它收到缺项证据和工程概览。它只返回针对该问题的 JSON 修复步骤，或说明无法根据工程证据修复。随后 Generator 按步骤修改，Executor 再验。这样，规划发生在已观察到失败之后，且 Planner 无需读完 Generator 的整段对话。</w:t>
-      </w:r>
-    </w:p>
-    <w:p>
-      <w:r>
-        <w:t>测试中的一条交接路径很直观：主场景缺失使 Godot 检查失败；Planner 要求补场景。补完后 Godot 通过，但模拟的需求审查指出“信号扫描交互缺失”；Planner 再给出修复步骤。Generator 写入 Game.gd 后，下一轮检查与模拟审查通过，任务进入 done。这条测试证明状态能按预期流转，不能代替对扫描玩法的真人试玩。</w:t>
-      </w:r>
-    </w:p>
-    <w:p>
-      <w:r>
-        <w:t>这次没有把 AI 返回的“完成”当作测试结论。我运行了仓库的 12 项系统实现测试，结果为 12 通过、0 失败；其中包含真实 Godot 导入与启动。另将 output/game/ 的六份历史目录复制到临时目录后重查：五份通过导入和无头启动，MAG_direct 缺少 project.godot。这个结果只说明技术启动情况，不说明游戏玩法已经符合任务书。历史用量部分分别列出调用次数、非缓存输入、缓存读取、输出、总 Token 和估算费用；三个任务中 LTGD 记录均较低，但这些会话早于当前实现，每个条件也只有一次记录，不能写成当前版本已证明的节省率。</w:t>
+        <w:t>这种协作是迭代的。项目提交记录能看到从“失败后才调用 Planner”、到“Generator 结束轮次后自动交接 Executor”、再到“用 Generator 明确交出的路径验证项目”的连续调整。每一步都是在已有实现上收紧一个具体行为。AI 承担了查代码、编辑文件和重复修正的工作；我持续决定这个行为是否符合最初的产品目标。</w:t>
       </w:r>
     </w:p>
     <w:p>
@@ -86,25 +112,22 @@
         <w:pStyle w:val="Heading1"/>
       </w:pPr>
       <w:r>
-        <w:t>3 AI 如何辅助写作与作图</w:t>
+        <w:t>4 人工审阅与测试怎样介入</w:t>
       </w:r>
     </w:p>
     <w:p>
       <w:r>
-        <w:t>英文报告的初稿依据 README、扩展源码、测试、历史 DOCX 和用量导出生成。我逐段核对“谁触发下一步”“检查的是哪个目录”“通过的含义”以及每个数字的来源。旧 DOCX 写的是手动 godot_verify、先局部修复再规划、godot_finish 完成；当前代码已改成结束轮次后自动检查、首次确认失败即调用 Planner、独立需求审查后才完成。随后参考 Yoon 等的 PaT 论文，将英文报告的主线改成“直接尝试—执行反馈—失败后规划—成本与完成度共同评价”。借用的是论证顺序和规划时机，没有把论文的 Best-of-N、递归分解、异构模型实验或成本数字写成 LTGD 已实现的内容。</w:t>
+        <w:t>AI 提交实现后，我首先看它是否守住需求边界：入口是否仍是 Pi 对话，游戏是否写到正确目录，三个角色是否各做各的事，异常时是否有明确停止原因。随后检查关键代码和测试，而不是只读 AI 的完成说明。项目当前的控制逻辑规定：Godot 失败进入 plan，Godot 通过进入 review；需求审查发现缺项也进入 plan，两项检查通过才进入 done。这些状态分支可以从 controller.ts 和扩展入口核对。</w:t>
       </w:r>
     </w:p>
     <w:p>
       <w:r>
-        <w:t>框架图用 Python 绘制，先列节点，再为每条箭头写触发条件。图 1 区分 Pi、Generator、Executor、Planner 与 Godot；图 2 把 Executor review 明确标为 Executor 的阶段，并在 Godot 检查处标“0 LLM tokens”、在审查和 Planner 处标出额外模型调用。英文报告的图注限定了图的证据范围：done 需要 Godot PASS 和需求审查通过，但图不能证明游戏可玩。新增的图 3 从六份 usage.json 读取 Total Tokens，以每个游戏的 Baseline 与 LTGD 两根柱子显示差距；柱顶标出总量，游戏名下标出相对 Baseline 的节约率。</w:t>
+        <w:t>自动测试用于检查可重复的系统行为。现有 12 项测试覆盖 Pi 提示触发、项目路径交接、外部输出目录、状态转换、Planner 输入、需求审查、修复循环、恢复会话、真实 Godot 导入与启动，以及 CMD 启动脚本。此前技术报告记录的结果是 12 项通过、0 项失败。测试中有模拟模型判断的环节，因此它证明的是流程按预期流转，不能证明一个游戏已经好玩或所有功能都能由玩家完成。</w:t>
       </w:r>
     </w:p>
     <w:p>
-      <w:pPr>
-        <w:pStyle w:val="Heading1"/>
-      </w:pPr>
       <w:r>
-        <w:t>4 发现的问题与修改前后对比</w:t>
+        <w:t>我还需要人工查看生成工程和运行结果，特别是主场景、输入操作、关卡推进、界面反馈，以及任务书中明确提出的玩法。无头启动只运行有限帧数，源码审查也看不到完整的游玩体验。若实际体验和需求不符，我把可复现的现象、预期结果和相关文件位置反馈给 AI，再审阅修正后的代码并重新测试。人工 review 和测试是对 AI 输出的验收，也是下一轮自然语言任务的来源。</w:t>
       </w:r>
     </w:p>
     <w:tbl>
@@ -115,10 +138,9 @@
         <w:tblLook w:firstColumn="1" w:firstRow="1" w:lastColumn="0" w:lastRow="0" w:noHBand="0" w:noVBand="1" w:val="04A0"/>
       </w:tblPr>
       <w:tblGrid>
-        <w:gridCol w:w="2469"/>
-        <w:gridCol w:w="2469"/>
-        <w:gridCol w:w="2469"/>
-        <w:gridCol w:w="2469"/>
+        <w:gridCol w:w="3293"/>
+        <w:gridCol w:w="3293"/>
+        <w:gridCol w:w="3293"/>
       </w:tblGrid>
       <w:tr>
         <w:trPr>
@@ -127,7 +149,7 @@
         </w:trPr>
         <w:tc>
           <w:tcPr>
-            <w:tcW w:type="dxa" w:w="1339"/>
+            <w:tcW w:type="dxa" w:w="1901"/>
             <w:shd w:fill="EAF1F6"/>
             <w:vAlign w:val="center"/>
           </w:tcPr>
@@ -143,13 +165,13 @@
                 <w:color w:val="1F374E"/>
                 <w:sz w:val="16"/>
               </w:rPr>
-              <w:t>检查对象</w:t>
+              <w:t>开发环节</w:t>
             </w:r>
           </w:p>
         </w:tc>
         <w:tc>
           <w:tcPr>
-            <w:tcW w:type="dxa" w:w="2707"/>
+            <w:tcW w:type="dxa" w:w="3168"/>
             <w:shd w:fill="EAF1F6"/>
             <w:vAlign w:val="center"/>
           </w:tcPr>
@@ -165,13 +187,13 @@
                 <w:color w:val="1F374E"/>
                 <w:sz w:val="16"/>
               </w:rPr>
-              <w:t>修改前</w:t>
+              <w:t>我提供或判断的内容</w:t>
             </w:r>
           </w:p>
         </w:tc>
         <w:tc>
           <w:tcPr>
-            <w:tcW w:type="dxa" w:w="3154"/>
+            <w:tcW w:type="dxa" w:w="4680"/>
             <w:shd w:fill="EAF1F6"/>
             <w:vAlign w:val="center"/>
           </w:tcPr>
@@ -187,29 +209,7 @@
                 <w:color w:val="1F374E"/>
                 <w:sz w:val="16"/>
               </w:rPr>
-              <w:t>修改后</w:t>
-            </w:r>
-          </w:p>
-        </w:tc>
-        <w:tc>
-          <w:tcPr>
-            <w:tcW w:type="dxa" w:w="2549"/>
-            <w:shd w:fill="EAF1F6"/>
-            <w:vAlign w:val="center"/>
-          </w:tcPr>
-          <w:p>
-            <w:pPr>
-              <w:keepNext/>
-              <w:spacing w:after="0" w:before="0"/>
-            </w:pPr>
-            <w:r>
-              <w:rPr>
-                <w:rFonts w:ascii="Microsoft YaHei" w:hAnsi="Microsoft YaHei"/>
-                <w:b/>
-                <w:color w:val="1F374E"/>
-                <w:sz w:val="16"/>
-              </w:rPr>
-              <w:t>修改原因</w:t>
+              <w:t>AI 承担的工作</w:t>
             </w:r>
           </w:p>
         </w:tc>
@@ -220,7 +220,7 @@
         </w:trPr>
         <w:tc>
           <w:tcPr>
-            <w:tcW w:type="dxa" w:w="1339"/>
+            <w:tcW w:type="dxa" w:w="1901"/>
             <w:vAlign w:val="center"/>
           </w:tcPr>
           <w:p>
@@ -234,13 +234,13 @@
                 <w:color w:val="232A30"/>
                 <w:sz w:val="16"/>
               </w:rPr>
-              <w:t>英文方法叙述</w:t>
+              <w:t>定义任务</w:t>
             </w:r>
           </w:p>
         </w:tc>
         <w:tc>
           <w:tcPr>
-            <w:tcW w:type="dxa" w:w="2707"/>
+            <w:tcW w:type="dxa" w:w="3168"/>
             <w:vAlign w:val="center"/>
           </w:tcPr>
           <w:p>
@@ -254,13 +254,13 @@
                 <w:color w:val="232A30"/>
                 <w:sz w:val="16"/>
               </w:rPr>
-              <w:t>旧报告：“On the first technical failure, the controller enters repair ... A second failed verification moves to plan.”</w:t>
+              <w:t>说明要解决的问题、使用场景和完成标准</w:t>
             </w:r>
           </w:p>
         </w:tc>
         <w:tc>
           <w:tcPr>
-            <w:tcW w:type="dxa" w:w="3154"/>
+            <w:tcW w:type="dxa" w:w="4680"/>
             <w:vAlign w:val="center"/>
           </w:tcPr>
           <w:p>
@@ -274,13 +274,18 @@
                 <w:color w:val="232A30"/>
                 <w:sz w:val="16"/>
               </w:rPr>
-              <w:t>新报告：“Any confirmed Godot failure or concrete missing requirement moves the task to plan.”</w:t>
+              <w:t>阅读现有项目，形成可执行的修改范围</w:t>
             </w:r>
           </w:p>
         </w:tc>
+      </w:tr>
+      <w:tr>
+        <w:trPr>
+          <w:cantSplit/>
+        </w:trPr>
         <w:tc>
           <w:tcPr>
-            <w:tcW w:type="dxa" w:w="2549"/>
+            <w:tcW w:type="dxa" w:w="1901"/>
             <w:vAlign w:val="center"/>
           </w:tcPr>
           <w:p>
@@ -294,18 +299,13 @@
                 <w:color w:val="232A30"/>
                 <w:sz w:val="16"/>
               </w:rPr>
-              <w:t>controller.ts 的 recordVerification 在首次失败后即设为 plan；旧句已与代码不符。</w:t>
+              <w:t>约束实现</w:t>
             </w:r>
           </w:p>
         </w:tc>
-      </w:tr>
-      <w:tr>
-        <w:trPr>
-          <w:cantSplit/>
-        </w:trPr>
         <w:tc>
           <w:tcPr>
-            <w:tcW w:type="dxa" w:w="1339"/>
+            <w:tcW w:type="dxa" w:w="3168"/>
             <w:vAlign w:val="center"/>
           </w:tcPr>
           <w:p>
@@ -319,13 +319,13 @@
                 <w:color w:val="232A30"/>
                 <w:sz w:val="16"/>
               </w:rPr>
-              <w:t>完成条件</w:t>
+              <w:t>指定 Pi 入口、输出目录、共享目录等边界</w:t>
             </w:r>
           </w:p>
         </w:tc>
         <w:tc>
           <w:tcPr>
-            <w:tcW w:type="dxa" w:w="2707"/>
+            <w:tcW w:type="dxa" w:w="4680"/>
             <w:vAlign w:val="center"/>
           </w:tcPr>
           <w:p>
@@ -339,13 +339,18 @@
                 <w:color w:val="232A30"/>
                 <w:sz w:val="16"/>
               </w:rPr>
-              <w:t>旧图使用 “Verified → Finish gate / godot_finish to done”。</w:t>
+              <w:t>在扩展、启动脚本和测试中落实这些约束</w:t>
             </w:r>
           </w:p>
         </w:tc>
+      </w:tr>
+      <w:tr>
+        <w:trPr>
+          <w:cantSplit/>
+        </w:trPr>
         <w:tc>
           <w:tcPr>
-            <w:tcW w:type="dxa" w:w="3154"/>
+            <w:tcW w:type="dxa" w:w="1901"/>
             <w:vAlign w:val="center"/>
           </w:tcPr>
           <w:p>
@@ -359,13 +364,13 @@
                 <w:color w:val="232A30"/>
                 <w:sz w:val="16"/>
               </w:rPr>
-              <w:t>新图使用 “Godot PASS → Requirement review → done”，missing 返回 Planner。</w:t>
+              <w:t>审阅反馈</w:t>
             </w:r>
           </w:p>
         </w:tc>
         <w:tc>
           <w:tcPr>
-            <w:tcW w:type="dxa" w:w="2549"/>
+            <w:tcW w:type="dxa" w:w="3168"/>
             <w:vAlign w:val="center"/>
           </w:tcPr>
           <w:p>
@@ -379,18 +384,13 @@
                 <w:color w:val="232A30"/>
                 <w:sz w:val="16"/>
               </w:rPr>
-              <w:t>当前实现没有 godot_finish 工具；需求审查是独立模型请求。</w:t>
+              <w:t>指出错误目录、错误状态或遗漏需求等具体问题</w:t>
             </w:r>
           </w:p>
         </w:tc>
-      </w:tr>
-      <w:tr>
-        <w:trPr>
-          <w:cantSplit/>
-        </w:trPr>
         <w:tc>
           <w:tcPr>
-            <w:tcW w:type="dxa" w:w="1339"/>
+            <w:tcW w:type="dxa" w:w="4680"/>
             <w:vAlign w:val="center"/>
           </w:tcPr>
           <w:p>
@@ -404,13 +404,18 @@
                 <w:color w:val="232A30"/>
                 <w:sz w:val="16"/>
               </w:rPr>
-              <w:t>初稿中的套话</w:t>
+              <w:t>定位原因，修改代码并解释影响</w:t>
             </w:r>
           </w:p>
         </w:tc>
+      </w:tr>
+      <w:tr>
+        <w:trPr>
+          <w:cantSplit/>
+        </w:trPr>
         <w:tc>
           <w:tcPr>
-            <w:tcW w:type="dxa" w:w="2707"/>
+            <w:tcW w:type="dxa" w:w="1901"/>
             <w:vAlign w:val="center"/>
           </w:tcPr>
           <w:p>
@@ -424,13 +429,13 @@
                 <w:color w:val="232A30"/>
                 <w:sz w:val="16"/>
               </w:rPr>
-              <w:t>“本系统并不是盲目生成游戏，而是通过多角色闭环确保质量。”</w:t>
+              <w:t>验收结果</w:t>
             </w:r>
           </w:p>
         </w:tc>
         <w:tc>
           <w:tcPr>
-            <w:tcW w:type="dxa" w:w="3154"/>
+            <w:tcW w:type="dxa" w:w="3168"/>
             <w:vAlign w:val="center"/>
           </w:tcPr>
           <w:p>
@@ -444,13 +449,13 @@
                 <w:color w:val="232A30"/>
                 <w:sz w:val="16"/>
               </w:rPr>
-              <w:t>“Generator 写入工程后，Executor 自动导入并启动 Godot；需求审查另行检查原始要求。两项通过才记为 done。”</w:t>
+              <w:t>复核测试证据，运行并体验生成的游戏</w:t>
             </w:r>
           </w:p>
         </w:tc>
         <w:tc>
           <w:tcPr>
-            <w:tcW w:type="dxa" w:w="2549"/>
+            <w:tcW w:type="dxa" w:w="4680"/>
             <w:vAlign w:val="center"/>
           </w:tcPr>
           <w:p>
@@ -464,347 +469,7 @@
                 <w:color w:val="232A30"/>
                 <w:sz w:val="16"/>
               </w:rPr>
-              <w:t>初稿用否定式解释和“确保质量”掩盖了检查边界。修订句交代动作与完成条件。</w:t>
-            </w:r>
-          </w:p>
-        </w:tc>
-      </w:tr>
-      <w:tr>
-        <w:trPr>
-          <w:cantSplit/>
-        </w:trPr>
-        <w:tc>
-          <w:tcPr>
-            <w:tcW w:type="dxa" w:w="1339"/>
-            <w:vAlign w:val="center"/>
-          </w:tcPr>
-          <w:p>
-            <w:pPr>
-              <w:spacing w:after="0" w:before="0"/>
-            </w:pPr>
-            <w:r>
-              <w:rPr>
-                <w:rFonts w:ascii="Microsoft YaHei" w:hAnsi="Microsoft YaHei"/>
-                <w:b w:val="0"/>
-                <w:color w:val="232A30"/>
-                <w:sz w:val="16"/>
-              </w:rPr>
-              <w:t>结果表述</w:t>
-            </w:r>
-          </w:p>
-        </w:tc>
-        <w:tc>
-          <w:tcPr>
-            <w:tcW w:type="dxa" w:w="2707"/>
-            <w:vAlign w:val="center"/>
-          </w:tcPr>
-          <w:p>
-            <w:pPr>
-              <w:spacing w:after="0" w:before="0"/>
-            </w:pPr>
-            <w:r>
-              <w:rPr>
-                <w:rFonts w:ascii="Microsoft YaHei" w:hAnsi="Microsoft YaHei"/>
-                <w:b w:val="0"/>
-                <w:color w:val="232A30"/>
-                <w:sz w:val="16"/>
-              </w:rPr>
-              <w:t>“LTGD 显著降低 Token 消耗并提高游戏质量。”</w:t>
-            </w:r>
-          </w:p>
-        </w:tc>
-        <w:tc>
-          <w:tcPr>
-            <w:tcW w:type="dxa" w:w="3154"/>
-            <w:vAlign w:val="center"/>
-          </w:tcPr>
-          <w:p>
-            <w:pPr>
-              <w:spacing w:after="0" w:before="0"/>
-            </w:pPr>
-            <w:r>
-              <w:rPr>
-                <w:rFonts w:ascii="Microsoft YaHei" w:hAnsi="Microsoft YaHei"/>
-                <w:b w:val="0"/>
-                <w:color w:val="232A30"/>
-                <w:sz w:val="16"/>
-              </w:rPr>
-              <w:t>“三组历史 LTGD 会话的记录总量较低；当前资料不能证明这种差异由扩展造成，也没有共同的玩法评分。”</w:t>
-            </w:r>
-          </w:p>
-        </w:tc>
-        <w:tc>
-          <w:tcPr>
-            <w:tcW w:type="dxa" w:w="2549"/>
-            <w:vAlign w:val="center"/>
-          </w:tcPr>
-          <w:p>
-            <w:pPr>
-              <w:spacing w:after="0" w:before="0"/>
-            </w:pPr>
-            <w:r>
-              <w:rPr>
-                <w:rFonts w:ascii="Microsoft YaHei" w:hAnsi="Microsoft YaHei"/>
-                <w:b w:val="0"/>
-                <w:color w:val="232A30"/>
-                <w:sz w:val="16"/>
-              </w:rPr>
-              <w:t>每组只有一次旧版本会话，缺少相同评价标准，不能做因果或质量判断。</w:t>
-            </w:r>
-          </w:p>
-        </w:tc>
-      </w:tr>
-      <w:tr>
-        <w:trPr>
-          <w:cantSplit/>
-        </w:trPr>
-        <w:tc>
-          <w:tcPr>
-            <w:tcW w:type="dxa" w:w="1339"/>
-            <w:vAlign w:val="center"/>
-          </w:tcPr>
-          <w:p>
-            <w:pPr>
-              <w:spacing w:after="0" w:before="0"/>
-            </w:pPr>
-            <w:r>
-              <w:rPr>
-                <w:rFonts w:ascii="Microsoft YaHei" w:hAnsi="Microsoft YaHei"/>
-                <w:b w:val="0"/>
-                <w:color w:val="232A30"/>
-                <w:sz w:val="16"/>
-              </w:rPr>
-              <w:t>token 指标与表图</w:t>
-            </w:r>
-          </w:p>
-        </w:tc>
-        <w:tc>
-          <w:tcPr>
-            <w:tcW w:type="dxa" w:w="2707"/>
-            <w:vAlign w:val="center"/>
-          </w:tcPr>
-          <w:p>
-            <w:pPr>
-              <w:spacing w:after="0" w:before="0"/>
-            </w:pPr>
-            <w:r>
-              <w:rPr>
-                <w:rFonts w:ascii="Microsoft YaHei" w:hAnsi="Microsoft YaHei"/>
-                <w:b w:val="0"/>
-                <w:color w:val="232A30"/>
-                <w:sz w:val="16"/>
-              </w:rPr>
-              <w:t>初稿重复列游戏名，六行数值难以按游戏对照；只看 Total Tokens 还会掩盖缓存读取与费用的区别。</w:t>
-            </w:r>
-          </w:p>
-        </w:tc>
-        <w:tc>
-          <w:tcPr>
-            <w:tcW w:type="dxa" w:w="3154"/>
-            <w:vAlign w:val="center"/>
-          </w:tcPr>
-          <w:p>
-            <w:pPr>
-              <w:spacing w:after="0" w:before="0"/>
-            </w:pPr>
-            <w:r>
-              <w:rPr>
-                <w:rFonts w:ascii="Microsoft YaHei" w:hAnsi="Microsoft YaHei"/>
-                <w:b w:val="0"/>
-                <w:color w:val="232A30"/>
-                <w:sz w:val="16"/>
-              </w:rPr>
-              <w:t>英文表 1 每个游戏占一行，Baseline 与 LTGD 分列，保留 Calls、Input、Cache read、Output、Total 和 Cost；末列给出总 Token 节约率。图 3 用成对柱子呈现总量差距。</w:t>
-            </w:r>
-          </w:p>
-        </w:tc>
-        <w:tc>
-          <w:tcPr>
-            <w:tcW w:type="dxa" w:w="2549"/>
-            <w:vAlign w:val="center"/>
-          </w:tcPr>
-          <w:p>
-            <w:pPr>
-              <w:spacing w:after="0" w:before="0"/>
-            </w:pPr>
-            <w:r>
-              <w:rPr>
-                <w:rFonts w:ascii="Microsoft YaHei" w:hAnsi="Microsoft YaHei"/>
-                <w:b w:val="0"/>
-                <w:color w:val="232A30"/>
-                <w:sz w:val="16"/>
-              </w:rPr>
-              <w:t>按游戏配对更容易核对；题注写明计算式、缓存写入为零及单次历史会话的范围。</w:t>
-            </w:r>
-          </w:p>
-        </w:tc>
-      </w:tr>
-      <w:tr>
-        <w:trPr>
-          <w:cantSplit/>
-        </w:trPr>
-        <w:tc>
-          <w:tcPr>
-            <w:tcW w:type="dxa" w:w="1339"/>
-            <w:vAlign w:val="center"/>
-          </w:tcPr>
-          <w:p>
-            <w:pPr>
-              <w:spacing w:after="0" w:before="0"/>
-            </w:pPr>
-            <w:r>
-              <w:rPr>
-                <w:rFonts w:ascii="Microsoft YaHei" w:hAnsi="Microsoft YaHei"/>
-                <w:b w:val="0"/>
-                <w:color w:val="232A30"/>
-                <w:sz w:val="16"/>
-              </w:rPr>
-              <w:t>角色与图</w:t>
-            </w:r>
-          </w:p>
-        </w:tc>
-        <w:tc>
-          <w:tcPr>
-            <w:tcW w:type="dxa" w:w="2707"/>
-            <w:vAlign w:val="center"/>
-          </w:tcPr>
-          <w:p>
-            <w:pPr>
-              <w:spacing w:after="0" w:before="0"/>
-            </w:pPr>
-            <w:r>
-              <w:rPr>
-                <w:rFonts w:ascii="Microsoft YaHei" w:hAnsi="Microsoft YaHei"/>
-                <w:b w:val="0"/>
-                <w:color w:val="232A30"/>
-                <w:sz w:val="16"/>
-              </w:rPr>
-              <w:t>图 2 把 Review 画成与 Executor 并列的框，容易被读成第四个 Agent。</w:t>
-            </w:r>
-          </w:p>
-        </w:tc>
-        <w:tc>
-          <w:tcPr>
-            <w:tcW w:type="dxa" w:w="3154"/>
-            <w:vAlign w:val="center"/>
-          </w:tcPr>
-          <w:p>
-            <w:pPr>
-              <w:spacing w:after="0" w:before="0"/>
-            </w:pPr>
-            <w:r>
-              <w:rPr>
-                <w:rFonts w:ascii="Microsoft YaHei" w:hAnsi="Microsoft YaHei"/>
-                <w:b w:val="0"/>
-                <w:color w:val="232A30"/>
-                <w:sz w:val="16"/>
-              </w:rPr>
-              <w:t>框名改为 “Executor review”，标明它增加一次模型调用。</w:t>
-            </w:r>
-          </w:p>
-        </w:tc>
-        <w:tc>
-          <w:tcPr>
-            <w:tcW w:type="dxa" w:w="2549"/>
-            <w:vAlign w:val="center"/>
-          </w:tcPr>
-          <w:p>
-            <w:pPr>
-              <w:spacing w:after="0" w:before="0"/>
-            </w:pPr>
-            <w:r>
-              <w:rPr>
-                <w:rFonts w:ascii="Microsoft YaHei" w:hAnsi="Microsoft YaHei"/>
-                <w:b w:val="0"/>
-                <w:color w:val="232A30"/>
-                <w:sz w:val="16"/>
-              </w:rPr>
-              <w:t>executor.ts 定义审查，index.ts 在 Executor 流程中发起模型请求。</w:t>
-            </w:r>
-          </w:p>
-        </w:tc>
-      </w:tr>
-      <w:tr>
-        <w:trPr>
-          <w:cantSplit/>
-        </w:trPr>
-        <w:tc>
-          <w:tcPr>
-            <w:tcW w:type="dxa" w:w="1339"/>
-            <w:vAlign w:val="center"/>
-          </w:tcPr>
-          <w:p>
-            <w:pPr>
-              <w:spacing w:after="0" w:before="0"/>
-            </w:pPr>
-            <w:r>
-              <w:rPr>
-                <w:rFonts w:ascii="Microsoft YaHei" w:hAnsi="Microsoft YaHei"/>
-                <w:b w:val="0"/>
-                <w:color w:val="232A30"/>
-                <w:sz w:val="16"/>
-              </w:rPr>
-              <w:t>论文类比</w:t>
-            </w:r>
-          </w:p>
-        </w:tc>
-        <w:tc>
-          <w:tcPr>
-            <w:tcW w:type="dxa" w:w="2707"/>
-            <w:vAlign w:val="center"/>
-          </w:tcPr>
-          <w:p>
-            <w:pPr>
-              <w:spacing w:after="0" w:before="0"/>
-            </w:pPr>
-            <w:r>
-              <w:rPr>
-                <w:rFonts w:ascii="Microsoft YaHei" w:hAnsi="Microsoft YaHei"/>
-                <w:b w:val="0"/>
-                <w:color w:val="232A30"/>
-                <w:sz w:val="16"/>
-              </w:rPr>
-              <w:t>“采用 PaT，所以 LTGD 更省 Token。”</w:t>
-            </w:r>
-          </w:p>
-        </w:tc>
-        <w:tc>
-          <w:tcPr>
-            <w:tcW w:type="dxa" w:w="3154"/>
-            <w:vAlign w:val="center"/>
-          </w:tcPr>
-          <w:p>
-            <w:pPr>
-              <w:spacing w:after="0" w:before="0"/>
-            </w:pPr>
-            <w:r>
-              <w:rPr>
-                <w:rFonts w:ascii="Microsoft YaHei" w:hAnsi="Microsoft YaHei"/>
-                <w:b w:val="0"/>
-                <w:color w:val="232A30"/>
-                <w:sz w:val="16"/>
-              </w:rPr>
-              <w:t>“LTGD 在失败后才调用 Planner；三组历史日志呈现较低用量，但没有 always-plan 消融，也没有等质量对照。”</w:t>
-            </w:r>
-          </w:p>
-        </w:tc>
-        <w:tc>
-          <w:tcPr>
-            <w:tcW w:type="dxa" w:w="2549"/>
-            <w:vAlign w:val="center"/>
-          </w:tcPr>
-          <w:p>
-            <w:pPr>
-              <w:spacing w:after="0" w:before="0"/>
-            </w:pPr>
-            <w:r>
-              <w:rPr>
-                <w:rFonts w:ascii="Microsoft YaHei" w:hAnsi="Microsoft YaHei"/>
-                <w:b w:val="0"/>
-                <w:color w:val="232A30"/>
-                <w:sz w:val="16"/>
-              </w:rPr>
-              <w:t>PaT 的论证启发规划时机；它的实验数字不能替代 LTGD 的证据。</w:t>
+              <w:t>执行可重复检查，整理结果供人工判断</w:t>
             </w:r>
           </w:p>
         </w:tc>
@@ -816,121 +481,26 @@
       </w:pPr>
     </w:p>
     <w:p>
-      <w:r>
-        <w:t>下图把旧报告 Figure 2 的关系按原意重绘。它显示“首次失败先局部修复”和“godot_finish 完成”，适合旧实现，却会误导读者理解当前代码。</w:t>
-      </w:r>
-    </w:p>
-    <w:p>
       <w:pPr>
-        <w:spacing w:before="100"/>
-        <w:jc w:val="center"/>
+        <w:pStyle w:val="Heading1"/>
       </w:pPr>
       <w:r>
-        <w:drawing>
-          <wp:inline xmlns:a="http://schemas.openxmlformats.org/drawingml/2006/main" xmlns:pic="http://schemas.openxmlformats.org/drawingml/2006/picture">
-            <wp:extent cx="5623560" cy="1718310"/>
-            <wp:docPr id="1" name="Picture 1"/>
-            <wp:cNvGraphicFramePr>
-              <a:graphicFrameLocks noChangeAspect="1"/>
-            </wp:cNvGraphicFramePr>
-            <a:graphic>
-              <a:graphicData uri="http://schemas.openxmlformats.org/drawingml/2006/picture">
-                <pic:pic>
-                  <pic:nvPicPr>
-                    <pic:cNvPr id="0" name="ltgd_legacy_flow_2026-09-30.png"/>
-                    <pic:cNvPicPr/>
-                  </pic:nvPicPr>
-                  <pic:blipFill>
-                    <a:blip r:embed="rId10"/>
-                    <a:stretch>
-                      <a:fillRect/>
-                    </a:stretch>
-                  </pic:blipFill>
-                  <pic:spPr>
-                    <a:xfrm>
-                      <a:off x="0" y="0"/>
-                      <a:ext cx="5623560" cy="1718310"/>
-                    </a:xfrm>
-                    <a:prstGeom prst="rect"/>
-                  </pic:spPr>
-                </pic:pic>
-              </a:graphicData>
-            </a:graphic>
-          </wp:inline>
-        </w:drawing>
-      </w:r>
-    </w:p>
-    <w:p>
-      <w:pPr>
-        <w:spacing w:after="160"/>
-        <w:jc w:val="center"/>
-      </w:pPr>
-      <w:r>
-        <w:rPr>
-          <w:i/>
-          <w:color w:val="535D68"/>
-          <w:sz w:val="17"/>
-        </w:rPr>
-        <w:t>旧报告流程关系重绘</w:t>
+        <w:t>5 一次具体的修改链条</w:t>
       </w:r>
     </w:p>
     <w:p>
       <w:r>
-        <w:t>英文技术报告使用的新版图把两个失败入口都接到 Planner，并把 Godot 检查和需求审查分开。箭头上的 FAIL、MISSING、PASS 是实际分支条件。图中也显示省 Token 的条件：首轮通过时跳过 Planner；如果失败，则增加 Planner 和下一轮 Generator 调用。需求审查是每次 Godot PASS 后必须付出的模型成本。</w:t>
+        <w:t>项目路径交接能说明这种工作方式。最初只说“检查生成的游戏”还不够，因为工作目录里可能有多个 Godot 工程，系统可能检查到旧目录。我把问题具体化为：Executor 必须检查 Generator 本轮真正交出的目录，不能从用户描述或目录扫描中猜一个路径。AI 随后把 &lt;ltgd-project-path&gt;...&lt;/ltgd-project-path&gt; 作为交接格式写入 Generator 的结束要求，由扩展读取该路径；目录不存在或缺少 project.godot 时停止并报告原因。对应测试覆盖默认目录、指定的绝对路径，以及无效交接不会退回到其他工程。</w:t>
       </w:r>
     </w:p>
     <w:p>
-      <w:pPr>
-        <w:spacing w:before="100"/>
-        <w:jc w:val="center"/>
-      </w:pPr>
       <w:r>
-        <w:drawing>
-          <wp:inline xmlns:a="http://schemas.openxmlformats.org/drawingml/2006/main" xmlns:pic="http://schemas.openxmlformats.org/drawingml/2006/picture">
-            <wp:extent cx="5623560" cy="2686812"/>
-            <wp:docPr id="2" name="Picture 2"/>
-            <wp:cNvGraphicFramePr>
-              <a:graphicFrameLocks noChangeAspect="1"/>
-            </wp:cNvGraphicFramePr>
-            <a:graphic>
-              <a:graphicData uri="http://schemas.openxmlformats.org/drawingml/2006/picture">
-                <pic:pic>
-                  <pic:nvPicPr>
-                    <pic:cNvPr id="0" name="ltgd_control_flow_2026-09-30.png"/>
-                    <pic:cNvPicPr/>
-                  </pic:nvPicPr>
-                  <pic:blipFill>
-                    <a:blip r:embed="rId11"/>
-                    <a:stretch>
-                      <a:fillRect/>
-                    </a:stretch>
-                  </pic:blipFill>
-                  <pic:spPr>
-                    <a:xfrm>
-                      <a:off x="0" y="0"/>
-                      <a:ext cx="5623560" cy="2686812"/>
-                    </a:xfrm>
-                    <a:prstGeom prst="rect"/>
-                  </pic:spPr>
-                </pic:pic>
-              </a:graphicData>
-            </a:graphic>
-          </wp:inline>
-        </w:drawing>
+        <w:t>完成条件也经历了类似修正。旧材料中的 godot_finish 和“技术检查通过即完成”已不能准确描述当前实现。我要求按实际代码重新界定完成：Executor 先运行 Godot 结构、导入和启动检查；通过后，再用独立模型请求对照原始需求和工程文件。AI 修改了状态流转、测试与报告叙述，使 done 需要当前工程的 Godot PASS 和需求审查 implemented。这个例子说明，人工 review 不只是挑语句错误，也会把模糊的“完成”变成可核对的程序条件。</w:t>
       </w:r>
     </w:p>
     <w:p>
-      <w:pPr>
-        <w:spacing w:after="160"/>
-        <w:jc w:val="center"/>
-      </w:pPr>
       <w:r>
-        <w:rPr>
-          <w:i/>
-          <w:color w:val="535D68"/>
-          <w:sz w:val="17"/>
-        </w:rPr>
-        <w:t>当前实现的失败与返回路径</w:t>
+        <w:t>同时，人工验收保留了自动检查的边界。即使状态进入 done，我仍需按原始任务亲自操作游戏；如果扫描交互、胜负条件或画面反馈与需求不符，就以实际现象提出新问题。AI 可以据此继续修改，但不能用自己的审查结果代替人的最终判断。</w:t>
       </w:r>
     </w:p>
     <w:p>
@@ -938,12 +508,17 @@
         <w:pStyle w:val="Heading1"/>
       </w:pPr>
       <w:r>
-        <w:t>5 检查和修正方式</w:t>
+        <w:t>6 AI 的作用和使用边界</w:t>
       </w:r>
     </w:p>
     <w:p>
       <w:r>
-        <w:t>我用源码核对流程，尤其检查 recordVerification、finishTask 和 agent_before_settle 的转移；用测试结果确认这些分支可执行；用隔离副本重跑 Godot，避免把历史截图或会话总结误当作当前验证。复核用量目录时发现原英文表漏掉了 output/token_usage/PIB_LTGD/usage.json，补入后 Ivory Beats 的 Baseline 与 LTGD 总量分别为 8,268,231 和 5,121,436 Token。我逐个读取六份会话的首条用户需求和模型设置：每对首条任务文本完全一致，工作目录、模型与 high 思考设置一致；日志不能证明运行时文件快照和其他扩展配置完全相同，因此英文报告没有把它们称为严格控制实验。制表和作图后，我用原始 JSON 重算节约率，逐项核对表内总量、百分比和柱顶标注，并渲染 DOCX 检查分页、表格和图中字形。</w:t>
+        <w:t>在本项目里，AI 最有价值的地方是把自然语言要求快速转成可审阅的代码、测试和文档，并能针对具体失败继续修改。它减少了我在文件定位、重复编辑和常规检查上的操作量；我可以把注意力放在问题定义、功能取舍和结果验收上。报告与框架图的整理也使用了 AI 辅助，但那是开发成果的表达工作，并不等同于 AI 对系统质量的独立证明。</w:t>
+      </w:r>
+    </w:p>
+    <w:p>
+      <w:r>
+        <w:t>AI 也会出现理解偏差：把“能启动”理解成“需求完成”，把已有目录误当作本轮输出，或在修复时加入没有请求的功能。因此，自然语言任务要写出对象、边界和可观察的通过条件；审阅时要看实际改动和测试证据。历史三组 LTGD 会话记录的 Token 用量低于对应 Direct 会话，但样本少且早于当前实现，不能据此断言这套人机协作方法或当前扩展稳定节省了多少成本。</w:t>
       </w:r>
     </w:p>
     <w:p>
@@ -951,17 +526,12 @@
         <w:pStyle w:val="Heading1"/>
       </w:pPr>
       <w:r>
-        <w:t>6 结论与仍需人工判断的部分</w:t>
+        <w:t>7 结论</w:t>
       </w:r>
     </w:p>
     <w:p>
       <w:r>
-        <w:t>LTGD 已实现一条有明确交接条件的工作流：Generator 负责写与修，Executor 用本地 Godot 检查工程并通过模型核查原始需求，Planner 只对确认的失败提出修复步骤。首轮通过时不产生 Planner 调用；失败时才支付短证据规划与下一轮生成的成本。12 项系统测试通过，说明这些分支及启动入口可执行；五份历史工程快照通过本次 Godot 启动检查。三组历史会话中，LTGD 的 Total Tokens 比对应 Direct 记录低 38.1%–50.1%，估算费用低 26.0%–41.6%；下降最多的是缓存读取量。这些是旧版本单次会话的观察结果，与设计意图一致，却不能证明当前版本能稳定地以同等游戏完成度省 Token。</w:t>
-      </w:r>
-    </w:p>
-    <w:p>
-      <w:r>
-        <w:t>独立需求审查读取项目文字，无法代替玩家操作和视觉检查；它自身还增加一次模型调用。Godot 无头启动也不会覆盖完整关卡流程。因此目前可以得出“自动验证与失败后定向修复机制已实现、历史记录呈现较低用量”的结论，不能得出“游戏质量提高”或“当前版本稳定节省 Token”的结论。后两项需要固定任务输入与验收标准，重复运行 Direct、LTGD 和始终预先规划的版本，并比较每次调用、Token、费用和共同的玩法通过率。</w:t>
+        <w:t>LTGD Agent System 的开发过程可以概括为：我定义问题和边界，用自然语言交付具体开发任务；AI 阅读项目并完成实现；我对照原始目标 review 代码、运行测试和体验游戏，再把发现的问题交给 AI 修正。项目中的路径交接、失败后规划、Godot 检查与需求审查，都是这种反复澄清和验证的结果。AI 提高了实现与迭代的速度，人工判断则决定系统最终是否解决了起初提出的问题。</w:t>
       </w:r>
     </w:p>
     <w:sectPr>
@@ -1427,7 +997,7 @@
       <w:rFonts w:asciiTheme="majorHAnsi" w:eastAsiaTheme="majorEastAsia" w:hAnsiTheme="majorHAnsi" w:cstheme="majorBidi" w:ascii="Microsoft YaHei" w:hAnsi="Microsoft YaHei"/>
       <w:b/>
       <w:bCs/>
-      <w:color w:val="1F374E"/>
+      <w:color w:val="000000"/>
       <w:sz w:val="28"/>
       <w:szCs w:val="28"/>
     </w:rPr>
@@ -1451,7 +1021,7 @@
       <w:rFonts w:asciiTheme="majorHAnsi" w:eastAsiaTheme="majorEastAsia" w:hAnsiTheme="majorHAnsi" w:cstheme="majorBidi" w:ascii="Microsoft YaHei" w:hAnsi="Microsoft YaHei"/>
       <w:b/>
       <w:bCs/>
-      <w:color w:val="1F374E"/>
+      <w:color w:val="000000"/>
       <w:sz w:val="23"/>
       <w:szCs w:val="26"/>
     </w:rPr>

</xml_diff>